<commit_message>
List of Online Tutorials
</commit_message>
<xml_diff>
--- a/List of online tutorial-updated.docx
+++ b/List of online tutorial-updated.docx
@@ -1,6 +1,6 @@
 
 <file path=word/document.xml><?xml version="1.0" encoding="utf-8"?>
-<w:document xmlns:wpc="http://schemas.microsoft.com/office/word/2010/wordprocessingCanvas" xmlns:cx="http://schemas.microsoft.com/office/drawing/2014/chartex" xmlns:mc="http://schemas.openxmlformats.org/markup-compatibility/2006" xmlns:o="urn:schemas-microsoft-com:office:office" xmlns:r="http://schemas.openxmlformats.org/officeDocument/2006/relationships" xmlns:m="http://schemas.openxmlformats.org/officeDocument/2006/math" xmlns:v="urn:schemas-microsoft-com:vml" xmlns:wp14="http://schemas.microsoft.com/office/word/2010/wordprocessingDrawing" xmlns:wp="http://schemas.openxmlformats.org/drawingml/2006/wordprocessingDrawing" xmlns:w10="urn:schemas-microsoft-com:office:word" xmlns:w="http://schemas.openxmlformats.org/wordprocessingml/2006/main" xmlns:w14="http://schemas.microsoft.com/office/word/2010/wordml" xmlns:w15="http://schemas.microsoft.com/office/word/2012/wordml" xmlns:w16se="http://schemas.microsoft.com/office/word/2015/wordml/symex" xmlns:wpg="http://schemas.microsoft.com/office/word/2010/wordprocessingGroup" xmlns:wpi="http://schemas.microsoft.com/office/word/2010/wordprocessingInk" xmlns:wne="http://schemas.microsoft.com/office/word/2006/wordml" xmlns:wps="http://schemas.microsoft.com/office/word/2010/wordprocessingShape" mc:Ignorable="w14 w15 w16se wp14">
+<w:document xmlns:wpc="http://schemas.microsoft.com/office/word/2010/wordprocessingCanvas" xmlns:cx="http://schemas.microsoft.com/office/drawing/2014/chartex" xmlns:cx1="http://schemas.microsoft.com/office/drawing/2015/9/8/chartex" xmlns:cx2="http://schemas.microsoft.com/office/drawing/2015/10/21/chartex" xmlns:cx3="http://schemas.microsoft.com/office/drawing/2016/5/9/chartex" xmlns:cx4="http://schemas.microsoft.com/office/drawing/2016/5/10/chartex" xmlns:cx5="http://schemas.microsoft.com/office/drawing/2016/5/11/chartex" xmlns:cx6="http://schemas.microsoft.com/office/drawing/2016/5/12/chartex" xmlns:cx7="http://schemas.microsoft.com/office/drawing/2016/5/13/chartex" xmlns:cx8="http://schemas.microsoft.com/office/drawing/2016/5/14/chartex" xmlns:mc="http://schemas.openxmlformats.org/markup-compatibility/2006" xmlns:aink="http://schemas.microsoft.com/office/drawing/2016/ink" xmlns:am3d="http://schemas.microsoft.com/office/drawing/2017/model3d" xmlns:o="urn:schemas-microsoft-com:office:office" xmlns:oel="http://schemas.microsoft.com/office/2019/extlst" xmlns:r="http://schemas.openxmlformats.org/officeDocument/2006/relationships" xmlns:m="http://schemas.openxmlformats.org/officeDocument/2006/math" xmlns:v="urn:schemas-microsoft-com:vml" xmlns:wp14="http://schemas.microsoft.com/office/word/2010/wordprocessingDrawing" xmlns:wp="http://schemas.openxmlformats.org/drawingml/2006/wordprocessingDrawing" xmlns:w10="urn:schemas-microsoft-com:office:word" xmlns:w="http://schemas.openxmlformats.org/wordprocessingml/2006/main" xmlns:w14="http://schemas.microsoft.com/office/word/2010/wordml" xmlns:w15="http://schemas.microsoft.com/office/word/2012/wordml" xmlns:w16cex="http://schemas.microsoft.com/office/word/2018/wordml/cex" xmlns:w16cid="http://schemas.microsoft.com/office/word/2016/wordml/cid" xmlns:w16="http://schemas.microsoft.com/office/word/2018/wordml" xmlns:w16du="http://schemas.microsoft.com/office/word/2023/wordml/word16du" xmlns:w16sdtdh="http://schemas.microsoft.com/office/word/2020/wordml/sdtdatahash" xmlns:w16sdtfl="http://schemas.microsoft.com/office/word/2024/wordml/sdtformatlock" xmlns:w16se="http://schemas.microsoft.com/office/word/2015/wordml/symex" xmlns:wpg="http://schemas.microsoft.com/office/word/2010/wordprocessingGroup" xmlns:wpi="http://schemas.microsoft.com/office/word/2010/wordprocessingInk" xmlns:wne="http://schemas.microsoft.com/office/word/2006/wordml" xmlns:wps="http://schemas.microsoft.com/office/word/2010/wordprocessingShape" mc:Ignorable="w14 w15 w16se w16cid w16 w16cex w16sdtdh w16sdtfl w16du wp14">
   <w:body>
     <w:p>
       <w:pPr>
@@ -10,8 +10,6 @@
           <w:szCs w:val="30"/>
         </w:rPr>
       </w:pPr>
-      <w:bookmarkStart w:id="0" w:name="_GoBack"/>
-      <w:bookmarkEnd w:id="0"/>
       <w:r>
         <w:rPr>
           <w:b/>
@@ -20,6 +18,74 @@
         </w:rPr>
         <w:t>Online Video Tutorial</w:t>
       </w:r>
+      <w:r>
+        <w:rPr>
+          <w:b/>
+          <w:sz w:val="30"/>
+          <w:szCs w:val="30"/>
+        </w:rPr>
+        <w:t xml:space="preserve"> </w:t>
+      </w:r>
+      <w:r>
+        <w:rPr>
+          <w:b/>
+          <w:sz w:val="30"/>
+          <w:szCs w:val="30"/>
+        </w:rPr>
+        <w:t xml:space="preserve">(Dalhousie Libraries) </w:t>
+      </w:r>
+    </w:p>
+    <w:p>
+      <w:pPr>
+        <w:rPr>
+          <w:b/>
+          <w:sz w:val="30"/>
+          <w:szCs w:val="30"/>
+        </w:rPr>
+      </w:pPr>
+    </w:p>
+    <w:p>
+      <w:pPr>
+        <w:rPr>
+          <w:bCs/>
+          <w:sz w:val="30"/>
+          <w:szCs w:val="30"/>
+        </w:rPr>
+      </w:pPr>
+      <w:r>
+        <w:rPr>
+          <w:bCs/>
+          <w:sz w:val="30"/>
+          <w:szCs w:val="30"/>
+        </w:rPr>
+        <w:t xml:space="preserve">As part of an accessibility enhancement project, I created 12 online tutorials using scripts and voice recordings developed by four librarians between 2018 and 2020. </w:t>
+      </w:r>
+    </w:p>
+    <w:p>
+      <w:pPr>
+        <w:rPr>
+          <w:bCs/>
+          <w:sz w:val="30"/>
+          <w:szCs w:val="30"/>
+        </w:rPr>
+      </w:pPr>
+      <w:r>
+        <w:rPr>
+          <w:bCs/>
+          <w:sz w:val="30"/>
+          <w:szCs w:val="30"/>
+        </w:rPr>
+        <w:t>As of May 5, 2026, seven videos are publicly available.</w:t>
+      </w:r>
+    </w:p>
+    <w:p>
+      <w:pPr>
+        <w:rPr>
+          <w:b/>
+          <w:sz w:val="30"/>
+          <w:szCs w:val="30"/>
+        </w:rPr>
+      </w:pPr>
     </w:p>
     <w:p>
       <w:pPr>
@@ -74,7 +140,7 @@
             <w:sz w:val="24"/>
             <w:szCs w:val="24"/>
           </w:rPr>
-          <w:t>https://www.yo</w:t>
+          <w:t>https://www.youtube.com/watch?v=</w:t>
         </w:r>
         <w:r>
           <w:rPr>
@@ -82,7 +148,7 @@
             <w:sz w:val="24"/>
             <w:szCs w:val="24"/>
           </w:rPr>
-          <w:t>utube.com/watch?v=IEEz_oVi2xE</w:t>
+          <w:t>IEEz_oVi2xE</w:t>
         </w:r>
       </w:hyperlink>
     </w:p>
@@ -103,89 +169,6 @@
     </w:p>
     <w:p>
       <w:hyperlink r:id="rId5" w:history="1">
-        <w:r>
-          <w:rPr>
-            <w:rStyle w:val="Hyperlink"/>
-            <w:sz w:val="24"/>
-            <w:szCs w:val="24"/>
-          </w:rPr>
-          <w:t>https://www.youtube.com/watc</w:t>
-        </w:r>
-        <w:r>
-          <w:rPr>
-            <w:rStyle w:val="Hyperlink"/>
-            <w:sz w:val="24"/>
-            <w:szCs w:val="24"/>
-          </w:rPr>
-          <w:t>h?v=QT88MV7VQYs</w:t>
-        </w:r>
-      </w:hyperlink>
-    </w:p>
-    <w:p>
-      <w:pPr>
-        <w:rPr>
-          <w:b/>
-          <w:sz w:val="30"/>
-          <w:szCs w:val="30"/>
-        </w:rPr>
-      </w:pPr>
-    </w:p>
-    <w:p>
-      <w:pPr>
-        <w:rPr>
-          <w:b/>
-          <w:sz w:val="30"/>
-          <w:szCs w:val="30"/>
-        </w:rPr>
-      </w:pPr>
-      <w:r>
-        <w:rPr>
-          <w:b/>
-          <w:sz w:val="30"/>
-          <w:szCs w:val="30"/>
-        </w:rPr>
-        <w:t>Health Science</w:t>
-      </w:r>
-      <w:r>
-        <w:rPr>
-          <w:b/>
-          <w:sz w:val="30"/>
-          <w:szCs w:val="30"/>
-        </w:rPr>
-        <w:t>s</w:t>
-      </w:r>
-    </w:p>
-    <w:p>
-      <w:pPr>
-        <w:rPr>
-          <w:sz w:val="24"/>
-          <w:szCs w:val="24"/>
-        </w:rPr>
-      </w:pPr>
-      <w:r>
-        <w:rPr>
-          <w:sz w:val="24"/>
-          <w:szCs w:val="24"/>
-        </w:rPr>
-        <w:t xml:space="preserve">Truncation, wild card, and proximity operators </w:t>
-      </w:r>
-      <w:r>
-        <w:rPr>
-          <w:sz w:val="24"/>
-          <w:szCs w:val="24"/>
-        </w:rPr>
-        <w:tab/>
-        <w:t xml:space="preserve"> </w:t>
-      </w:r>
-    </w:p>
-    <w:p>
-      <w:pPr>
-        <w:rPr>
-          <w:sz w:val="24"/>
-          <w:szCs w:val="24"/>
-        </w:rPr>
-      </w:pPr>
-      <w:hyperlink r:id="rId6" w:history="1">
         <w:r>
           <w:rPr>
             <w:rStyle w:val="Hyperlink"/>
@@ -200,23 +183,57 @@
             <w:sz w:val="24"/>
             <w:szCs w:val="24"/>
           </w:rPr>
-          <w:t>e.com/watch?v=yRHbnhtIk14</w:t>
+          <w:t>e.com/watch?v=QT88MV7VQYs</w:t>
         </w:r>
       </w:hyperlink>
     </w:p>
     <w:p>
       <w:pPr>
         <w:rPr>
-          <w:sz w:val="24"/>
-          <w:szCs w:val="24"/>
-          <w:lang w:val="fr-CA"/>
-        </w:rPr>
-      </w:pPr>
-      <w:r>
-        <w:rPr>
-          <w:sz w:val="24"/>
-          <w:szCs w:val="24"/>
-          <w:lang w:val="fr-CA"/>
+          <w:b/>
+          <w:sz w:val="30"/>
+          <w:szCs w:val="30"/>
+        </w:rPr>
+      </w:pPr>
+    </w:p>
+    <w:p>
+      <w:pPr>
+        <w:rPr>
+          <w:b/>
+          <w:sz w:val="30"/>
+          <w:szCs w:val="30"/>
+        </w:rPr>
+      </w:pPr>
+      <w:r>
+        <w:rPr>
+          <w:b/>
+          <w:sz w:val="30"/>
+          <w:szCs w:val="30"/>
+        </w:rPr>
+        <w:t>Health Science</w:t>
+      </w:r>
+      <w:r>
+        <w:rPr>
+          <w:b/>
+          <w:sz w:val="30"/>
+          <w:szCs w:val="30"/>
+        </w:rPr>
+        <w:t>s</w:t>
+      </w:r>
+    </w:p>
+    <w:p>
+      <w:pPr>
+        <w:rPr>
+          <w:sz w:val="24"/>
+          <w:szCs w:val="24"/>
+          <w:lang w:val="en-CA"/>
+        </w:rPr>
+      </w:pPr>
+      <w:r>
+        <w:rPr>
+          <w:sz w:val="24"/>
+          <w:szCs w:val="24"/>
+          <w:lang w:val="en-CA"/>
         </w:rPr>
         <w:t xml:space="preserve">DOSS </w:t>
       </w:r>
@@ -226,7 +243,41 @@
         <w:rPr>
           <w:sz w:val="24"/>
           <w:szCs w:val="24"/>
-          <w:lang w:val="fr-CA"/>
+          <w:lang w:val="en-CA"/>
+        </w:rPr>
+      </w:pPr>
+      <w:hyperlink r:id="rId6" w:history="1">
+        <w:r>
+          <w:rPr>
+            <w:rStyle w:val="Hyperlink"/>
+            <w:sz w:val="24"/>
+            <w:szCs w:val="24"/>
+            <w:lang w:val="en-CA"/>
+          </w:rPr>
+          <w:t>https://www.youtube.com/watch?v=jTidhetqo00</w:t>
+        </w:r>
+      </w:hyperlink>
+    </w:p>
+    <w:p>
+      <w:pPr>
+        <w:rPr>
+          <w:sz w:val="24"/>
+          <w:szCs w:val="24"/>
+        </w:rPr>
+      </w:pPr>
+      <w:r>
+        <w:rPr>
+          <w:sz w:val="24"/>
+          <w:szCs w:val="24"/>
+        </w:rPr>
+        <w:t>EBP Module 3 (Searching PubMed)</w:t>
+      </w:r>
+    </w:p>
+    <w:p>
+      <w:pPr>
+        <w:rPr>
+          <w:sz w:val="24"/>
+          <w:szCs w:val="24"/>
         </w:rPr>
       </w:pPr>
       <w:hyperlink r:id="rId7" w:history="1">
@@ -235,18 +286,8 @@
             <w:rStyle w:val="Hyperlink"/>
             <w:sz w:val="24"/>
             <w:szCs w:val="24"/>
-            <w:lang w:val="fr-CA"/>
           </w:rPr>
-          <w:t>https://www.youtube</w:t>
-        </w:r>
-        <w:r>
-          <w:rPr>
-            <w:rStyle w:val="Hyperlink"/>
-            <w:sz w:val="24"/>
-            <w:szCs w:val="24"/>
-            <w:lang w:val="fr-CA"/>
-          </w:rPr>
-          <w:t>.com/watch?v=jTidhetqo00</w:t>
+          <w:t>https://www.youtube.com/watch?v=6ybudH6rgjU</w:t>
         </w:r>
       </w:hyperlink>
     </w:p>
@@ -262,7 +303,14 @@
           <w:sz w:val="24"/>
           <w:szCs w:val="24"/>
         </w:rPr>
-        <w:t>EBP Module 3 (Searching PubMed)</w:t>
+        <w:t>PubMed</w:t>
+      </w:r>
+      <w:r>
+        <w:rPr>
+          <w:sz w:val="24"/>
+          <w:szCs w:val="24"/>
+        </w:rPr>
+        <w:t xml:space="preserve"> Searching</w:t>
       </w:r>
     </w:p>
     <w:p>
@@ -279,7 +327,80 @@
             <w:sz w:val="24"/>
             <w:szCs w:val="24"/>
           </w:rPr>
-          <w:t>https://www.yo</w:t>
+          <w:t>https://www.youtube.com/watch?v=cIRsbTW0cUU</w:t>
+        </w:r>
+      </w:hyperlink>
+    </w:p>
+    <w:p>
+      <w:pPr>
+        <w:rPr>
+          <w:sz w:val="24"/>
+          <w:szCs w:val="24"/>
+        </w:rPr>
+      </w:pPr>
+      <w:r>
+        <w:rPr>
+          <w:sz w:val="24"/>
+          <w:szCs w:val="24"/>
+        </w:rPr>
+        <w:t xml:space="preserve"> </w:t>
+      </w:r>
+    </w:p>
+    <w:p>
+      <w:pPr>
+        <w:rPr>
+          <w:b/>
+          <w:sz w:val="30"/>
+          <w:szCs w:val="30"/>
+        </w:rPr>
+      </w:pPr>
+      <w:r>
+        <w:rPr>
+          <w:b/>
+          <w:sz w:val="30"/>
+          <w:szCs w:val="30"/>
+        </w:rPr>
+        <w:t>Open Access</w:t>
+      </w:r>
+      <w:r>
+        <w:rPr>
+          <w:b/>
+          <w:sz w:val="30"/>
+          <w:szCs w:val="30"/>
+        </w:rPr>
+        <w:t xml:space="preserve"> </w:t>
+      </w:r>
+    </w:p>
+    <w:p>
+      <w:pPr>
+        <w:rPr>
+          <w:sz w:val="24"/>
+          <w:szCs w:val="24"/>
+        </w:rPr>
+      </w:pPr>
+      <w:r>
+        <w:rPr>
+          <w:sz w:val="24"/>
+          <w:szCs w:val="24"/>
+        </w:rPr>
+        <w:t>Open Access publishing</w:t>
+      </w:r>
+    </w:p>
+    <w:p>
+      <w:pPr>
+        <w:rPr>
+          <w:sz w:val="24"/>
+          <w:szCs w:val="24"/>
+        </w:rPr>
+      </w:pPr>
+      <w:hyperlink r:id="rId9" w:history="1">
+        <w:r>
+          <w:rPr>
+            <w:rStyle w:val="Hyperlink"/>
+            <w:sz w:val="24"/>
+            <w:szCs w:val="24"/>
+          </w:rPr>
+          <w:t>https://www.youtube.com/</w:t>
         </w:r>
         <w:r>
           <w:rPr>
@@ -287,181 +408,57 @@
             <w:sz w:val="24"/>
             <w:szCs w:val="24"/>
           </w:rPr>
-          <w:t>utube.com/watch?v=6ybudH6rgjU</w:t>
+          <w:t>watch?v=xzGT-4wno64</w:t>
         </w:r>
       </w:hyperlink>
     </w:p>
     <w:p>
       <w:pPr>
         <w:rPr>
-          <w:sz w:val="24"/>
-          <w:szCs w:val="24"/>
-        </w:rPr>
-      </w:pPr>
-      <w:r>
-        <w:rPr>
-          <w:sz w:val="24"/>
-          <w:szCs w:val="24"/>
-        </w:rPr>
-        <w:t>PubMed</w:t>
-      </w:r>
-      <w:r>
-        <w:rPr>
-          <w:sz w:val="24"/>
-          <w:szCs w:val="24"/>
-        </w:rPr>
-        <w:t xml:space="preserve"> Searching</w:t>
-      </w:r>
-    </w:p>
-    <w:p>
-      <w:pPr>
-        <w:rPr>
-          <w:sz w:val="24"/>
-          <w:szCs w:val="24"/>
-        </w:rPr>
-      </w:pPr>
-      <w:hyperlink r:id="rId9" w:history="1">
-        <w:r>
-          <w:rPr>
-            <w:rStyle w:val="Hyperlink"/>
-            <w:sz w:val="24"/>
-            <w:szCs w:val="24"/>
-          </w:rPr>
-          <w:t>https://www.youtube.c</w:t>
-        </w:r>
-        <w:r>
-          <w:rPr>
-            <w:rStyle w:val="Hyperlink"/>
-            <w:sz w:val="24"/>
-            <w:szCs w:val="24"/>
-          </w:rPr>
-          <w:t>om/watch?v=cIRsbTW0cUU</w:t>
-        </w:r>
-      </w:hyperlink>
-    </w:p>
-    <w:p>
-      <w:pPr>
-        <w:rPr>
-          <w:b/>
-          <w:sz w:val="30"/>
-          <w:szCs w:val="30"/>
-        </w:rPr>
-      </w:pPr>
-    </w:p>
-    <w:p>
-      <w:pPr>
-        <w:rPr>
-          <w:b/>
-          <w:sz w:val="30"/>
-          <w:szCs w:val="30"/>
-        </w:rPr>
-      </w:pPr>
-      <w:r>
-        <w:rPr>
-          <w:b/>
-          <w:sz w:val="30"/>
-          <w:szCs w:val="30"/>
-        </w:rPr>
-        <w:t>Open Access</w:t>
-      </w:r>
-      <w:r>
-        <w:rPr>
-          <w:b/>
-          <w:sz w:val="30"/>
-          <w:szCs w:val="30"/>
-        </w:rPr>
-        <w:t xml:space="preserve"> </w:t>
-      </w:r>
-    </w:p>
-    <w:p>
-      <w:pPr>
-        <w:rPr>
-          <w:sz w:val="24"/>
-          <w:szCs w:val="24"/>
-        </w:rPr>
-      </w:pPr>
-      <w:r>
-        <w:rPr>
-          <w:sz w:val="24"/>
-          <w:szCs w:val="24"/>
-        </w:rPr>
-        <w:t>Open Access publishing</w:t>
-      </w:r>
-    </w:p>
-    <w:p>
-      <w:pPr>
-        <w:rPr>
-          <w:sz w:val="24"/>
-          <w:szCs w:val="24"/>
-        </w:rPr>
-      </w:pPr>
+          <w:b/>
+          <w:sz w:val="30"/>
+          <w:szCs w:val="30"/>
+        </w:rPr>
+      </w:pPr>
+    </w:p>
+    <w:p>
+      <w:pPr>
+        <w:rPr>
+          <w:b/>
+          <w:sz w:val="30"/>
+          <w:szCs w:val="30"/>
+        </w:rPr>
+      </w:pPr>
+      <w:r>
+        <w:rPr>
+          <w:b/>
+          <w:sz w:val="30"/>
+          <w:szCs w:val="30"/>
+        </w:rPr>
+        <w:t xml:space="preserve">Copyright </w:t>
+      </w:r>
+    </w:p>
+    <w:p>
+      <w:r>
+        <w:t xml:space="preserve">Using stable links in Brightspace </w:t>
+      </w:r>
+      <w:r>
+        <w:tab/>
+      </w:r>
+    </w:p>
+    <w:p>
       <w:hyperlink r:id="rId10" w:history="1">
         <w:r>
           <w:rPr>
             <w:rStyle w:val="Hyperlink"/>
-            <w:sz w:val="24"/>
-            <w:szCs w:val="24"/>
           </w:rPr>
-          <w:t>https://www.youtube.c</w:t>
-        </w:r>
-        <w:r>
-          <w:rPr>
-            <w:rStyle w:val="Hyperlink"/>
-            <w:sz w:val="24"/>
-            <w:szCs w:val="24"/>
-          </w:rPr>
-          <w:t>om/watch?v=xzGT-4wno64</w:t>
-        </w:r>
-      </w:hyperlink>
-    </w:p>
-    <w:p>
-      <w:pPr>
-        <w:rPr>
-          <w:b/>
-          <w:sz w:val="30"/>
-          <w:szCs w:val="30"/>
-        </w:rPr>
-      </w:pPr>
-    </w:p>
-    <w:p>
-      <w:pPr>
-        <w:rPr>
-          <w:b/>
-          <w:sz w:val="30"/>
-          <w:szCs w:val="30"/>
-        </w:rPr>
-      </w:pPr>
-      <w:r>
-        <w:rPr>
-          <w:b/>
-          <w:sz w:val="30"/>
-          <w:szCs w:val="30"/>
-        </w:rPr>
-        <w:t xml:space="preserve">Copyright </w:t>
-      </w:r>
-    </w:p>
-    <w:p>
-      <w:r>
-        <w:lastRenderedPageBreak/>
-        <w:t xml:space="preserve">Using stable links in Brightspace </w:t>
-      </w:r>
-      <w:r>
-        <w:tab/>
-      </w:r>
-    </w:p>
-    <w:p>
-      <w:hyperlink r:id="rId11" w:history="1">
-        <w:r>
-          <w:rPr>
-            <w:rStyle w:val="Hyperlink"/>
-          </w:rPr>
-          <w:t>https://ww</w:t>
+          <w:t>https://www.youtube.com/watch?v=</w:t>
         </w:r>
         <w:r>
           <w:rPr>
             <w:rStyle w:val="Hyperlink"/>
           </w:rPr>
-          <w:t>w.youtube.com/watch?v=RUm9onZDpUg</w:t>
+          <w:t>RUm9onZDpUg</w:t>
         </w:r>
       </w:hyperlink>
     </w:p>
@@ -479,7 +476,7 @@
 </file>
 
 <file path=word/styles.xml><?xml version="1.0" encoding="utf-8"?>
-<w:styles xmlns:mc="http://schemas.openxmlformats.org/markup-compatibility/2006" xmlns:r="http://schemas.openxmlformats.org/officeDocument/2006/relationships" xmlns:w="http://schemas.openxmlformats.org/wordprocessingml/2006/main" xmlns:w14="http://schemas.microsoft.com/office/word/2010/wordml" xmlns:w15="http://schemas.microsoft.com/office/word/2012/wordml" xmlns:w16se="http://schemas.microsoft.com/office/word/2015/wordml/symex" mc:Ignorable="w14 w15 w16se">
+<w:styles xmlns:mc="http://schemas.openxmlformats.org/markup-compatibility/2006" xmlns:r="http://schemas.openxmlformats.org/officeDocument/2006/relationships" xmlns:w="http://schemas.openxmlformats.org/wordprocessingml/2006/main" xmlns:w14="http://schemas.microsoft.com/office/word/2010/wordml" xmlns:w15="http://schemas.microsoft.com/office/word/2012/wordml" xmlns:w16cex="http://schemas.microsoft.com/office/word/2018/wordml/cex" xmlns:w16cid="http://schemas.microsoft.com/office/word/2016/wordml/cid" xmlns:w16="http://schemas.microsoft.com/office/word/2018/wordml" xmlns:w16du="http://schemas.microsoft.com/office/word/2023/wordml/word16du" xmlns:w16sdtdh="http://schemas.microsoft.com/office/word/2020/wordml/sdtdatahash" xmlns:w16sdtfl="http://schemas.microsoft.com/office/word/2024/wordml/sdtformatlock" xmlns:w16se="http://schemas.microsoft.com/office/word/2015/wordml/symex" mc:Ignorable="w14 w15 w16se w16cid w16 w16cex w16sdtdh w16sdtfl w16du">
   <w:docDefaults>
     <w:rPrDefault>
       <w:rPr>
@@ -495,7 +492,7 @@
       </w:pPr>
     </w:pPrDefault>
   </w:docDefaults>
-  <w:latentStyles w:defLockedState="0" w:defUIPriority="99" w:defSemiHidden="0" w:defUnhideWhenUsed="0" w:defQFormat="0" w:count="371">
+  <w:latentStyles w:defLockedState="0" w:defUIPriority="99" w:defSemiHidden="0" w:defUnhideWhenUsed="0" w:defQFormat="0" w:count="376">
     <w:lsdException w:name="Normal" w:uiPriority="0" w:qFormat="1"/>
     <w:lsdException w:name="heading 1" w:uiPriority="9" w:qFormat="1"/>
     <w:lsdException w:name="heading 2" w:semiHidden="1" w:uiPriority="9" w:unhideWhenUsed="1" w:qFormat="1"/>
@@ -867,6 +864,11 @@
     <w:lsdException w:name="List Table 5 Dark Accent 6" w:uiPriority="50"/>
     <w:lsdException w:name="List Table 6 Colorful Accent 6" w:uiPriority="51"/>
     <w:lsdException w:name="List Table 7 Colorful Accent 6" w:uiPriority="52"/>
+    <w:lsdException w:name="Mention" w:semiHidden="1" w:unhideWhenUsed="1"/>
+    <w:lsdException w:name="Smart Hyperlink" w:semiHidden="1" w:unhideWhenUsed="1"/>
+    <w:lsdException w:name="Hashtag" w:semiHidden="1" w:unhideWhenUsed="1"/>
+    <w:lsdException w:name="Unresolved Mention" w:semiHidden="1" w:unhideWhenUsed="1"/>
+    <w:lsdException w:name="Smart Link" w:semiHidden="1" w:unhideWhenUsed="1"/>
   </w:latentStyles>
   <w:style w:type="paragraph" w:default="1" w:styleId="Normal">
     <w:name w:val="Normal"/>
@@ -875,7 +877,6 @@
   <w:style w:type="character" w:default="1" w:styleId="DefaultParagraphFont">
     <w:name w:val="Default Paragraph Font"/>
     <w:uiPriority w:val="1"/>
-    <w:semiHidden/>
     <w:unhideWhenUsed/>
   </w:style>
   <w:style w:type="table" w:default="1" w:styleId="TableNormal">
@@ -910,8 +911,8 @@
       <w:u w:val="single"/>
     </w:rPr>
   </w:style>
-  <w:style w:type="character" w:customStyle="1" w:styleId="UnresolvedMention">
-    <w:name w:val="Unresolved Mention"/>
+  <w:style w:type="character" w:customStyle="1" w:styleId="UnresolvedMention1">
+    <w:name w:val="Unresolved Mention1"/>
     <w:basedOn w:val="DefaultParagraphFont"/>
     <w:uiPriority w:val="99"/>
     <w:semiHidden/>

</xml_diff>